<commit_message>
TO TKA: ubah jadwal sekaligus untuk kelas lain pada tanggal/minggu yang sama; panduan
Co-Authored-By: Claude Opus 5.5 <noreply@anthropic.com>
</commit_message>
<xml_diff>
--- a/Panduan_Koordinator_TO_TKA.docx
+++ b/Panduan_Koordinator_TO_TKA.docx
@@ -4038,6 +4038,151 @@
         <w:t xml:space="preserve">4.4 Mengubah atau menambah jadwal</w:t>
       </w:r>
     </w:p>
+    <w:tbl>
+      <w:tblPr>
+        <w:tblW w:type="dxa" w:w="9638"/>
+        <w:tblBorders>
+          <w:top w:val="none" w:color="FFFFFF" w:sz="0"/>
+          <w:left w:val="single" w:color="2E9E5B" w:sz="30"/>
+          <w:bottom w:val="none" w:color="FFFFFF" w:sz="0"/>
+          <w:right w:val="none" w:color="FFFFFF" w:sz="0"/>
+          <w:insideH w:val="none" w:color="FFFFFF" w:sz="0"/>
+          <w:insideV w:val="none" w:color="FFFFFF" w:sz="0"/>
+        </w:tblBorders>
+      </w:tblPr>
+      <w:tblGrid>
+        <w:gridCol w:w="9638"/>
+      </w:tblGrid>
+      <w:tr>
+        <w:trPr>
+          <w:cantSplit/>
+        </w:trPr>
+        <w:tc>
+          <w:tcPr>
+            <w:tcW w:type="dxa" w:w="9638"/>
+            <w:shd w:fill="E7F5EC" w:color="auto" w:val="clear"/>
+            <w:tcMar>
+              <w:top w:type="dxa" w:w="120"/>
+              <w:left w:type="dxa" w:w="200"/>
+              <w:bottom w:type="dxa" w:w="120"/>
+              <w:right w:type="dxa" w:w="160"/>
+            </w:tcMar>
+          </w:tcPr>
+          <w:p>
+            <w:pPr>
+              <w:spacing w:after="40"/>
+            </w:pPr>
+            <w:r>
+              <w:rPr>
+                <w:b/>
+                <w:bCs/>
+                <w:color w:val="2E9E5B"/>
+                <w:sz w:val="20"/>
+                <w:szCs w:val="20"/>
+              </w:rPr>
+              <w:t xml:space="preserve">TO ditukar karena kegiatan sekolah</w:t>
+            </w:r>
+          </w:p>
+          <w:p>
+            <w:pPr>
+              <w:spacing w:after="40"/>
+            </w:pPr>
+            <w:r>
+              <w:rPr>
+                <w:sz w:val="19"/>
+                <w:szCs w:val="19"/>
+              </w:rPr>
+              <w:t xml:space="preserve">Contoh: Rabu dipakai kegiatan Agustusan, TO minggu ini pindah ke Kamis dan TO minggu depan (seharusnya Kamis) menjadi Rabu. Buka TO minggu ini → </w:t>
+            </w:r>
+            <w:r>
+              <w:rPr>
+                <w:b/>
+                <w:bCs/>
+                <w:sz w:val="19"/>
+                <w:szCs w:val="19"/>
+              </w:rPr>
+              <w:t xml:space="preserve">Ubah jadwal</w:t>
+            </w:r>
+            <w:r>
+              <w:rPr>
+                <w:sz w:val="19"/>
+                <w:szCs w:val="19"/>
+              </w:rPr>
+              <w:t xml:space="preserve"> → ganti tanggal ke Kamis → </w:t>
+            </w:r>
+            <w:r>
+              <w:rPr>
+                <w:b/>
+                <w:bCs/>
+                <w:sz w:val="19"/>
+                <w:szCs w:val="19"/>
+              </w:rPr>
+              <w:t xml:space="preserve">Simpan perubahan</w:t>
+            </w:r>
+            <w:r>
+              <w:rPr>
+                <w:sz w:val="19"/>
+                <w:szCs w:val="19"/>
+              </w:rPr>
+              <w:t xml:space="preserve">. Lalu buka TO minggu depan → ganti ke Rabu → </w:t>
+            </w:r>
+            <w:r>
+              <w:rPr>
+                <w:b/>
+                <w:bCs/>
+                <w:sz w:val="19"/>
+                <w:szCs w:val="19"/>
+              </w:rPr>
+              <w:t xml:space="preserve">Simpan</w:t>
+            </w:r>
+            <w:r>
+              <w:rPr>
+                <w:sz w:val="19"/>
+                <w:szCs w:val="19"/>
+              </w:rPr>
+              <w:t xml:space="preserve">. Dua langkah saja; kelas 10, 11, 12 ikut pindah. </w:t>
+            </w:r>
+            <w:r>
+              <w:rPr>
+                <w:b/>
+                <w:bCs/>
+                <w:sz w:val="19"/>
+                <w:szCs w:val="19"/>
+              </w:rPr>
+              <w:t xml:space="preserve">Periode tidak berubah</w:t>
+            </w:r>
+            <w:r>
+              <w:rPr>
+                <w:sz w:val="19"/>
+                <w:szCs w:val="19"/>
+              </w:rPr>
+              <w:t xml:space="preserve"> karena periode dihitung dari urutan TO, bukan tanggal. Bila sesinya sudah telanjur dibuat, ubah juga waktunya di bagian </w:t>
+            </w:r>
+            <w:r>
+              <w:rPr>
+                <w:b/>
+                <w:bCs/>
+                <w:sz w:val="19"/>
+                <w:szCs w:val="19"/>
+              </w:rPr>
+              <w:t xml:space="preserve">Sesi &amp; link</w:t>
+            </w:r>
+            <w:r>
+              <w:rPr>
+                <w:sz w:val="19"/>
+                <w:szCs w:val="19"/>
+              </w:rPr>
+              <w:t xml:space="preserve">.</w:t>
+            </w:r>
+          </w:p>
+        </w:tc>
+      </w:tr>
+    </w:tbl>
+    <w:p>
+      <w:pPr>
+        <w:spacing w:after="120"/>
+      </w:pPr>
+    </w:p>
     <w:p>
       <w:pPr>
         <w:pStyle w:val="ListParagraph"/>
@@ -4069,6 +4214,29 @@
       </w:r>
       <w:r>
         <w:t xml:space="preserve"> untuk libur mendadak.</w:t>
+      </w:r>
+    </w:p>
+    <w:p>
+      <w:pPr>
+        <w:pStyle w:val="ListParagraph"/>
+        <w:numPr>
+          <w:ilvl w:val="0"/>
+          <w:numId w:val="1"/>
+        </w:numPr>
+        <w:spacing w:after="60"/>
+      </w:pPr>
+      <w:r>
+        <w:t xml:space="preserve">Pilihan </w:t>
+      </w:r>
+      <w:r>
+        <w:rPr>
+          <w:b/>
+          <w:bCs/>
+        </w:rPr>
+        <w:t xml:space="preserve">Terapkan … juga ke kelas lain</w:t>
+      </w:r>
+      <w:r>
+        <w:t xml:space="preserve"> (sudah tercentang) memindahkan TO yang sama untuk semua tingkat pada tanggal itu (Wajib), atau semua kelas 11 pada minggu itu (Pilihan), sekali simpan.</w:t>
       </w:r>
     </w:p>
     <w:p>
@@ -7557,7 +7725,7 @@
                 <w:sz w:val="19"/>
                 <w:szCs w:val="19"/>
               </w:rPr>
-              <w:t xml:space="preserve">Apakah periode bisa diatur tanggalnya?</w:t>
+              <w:t xml:space="preserve">Tanggal TO berubah mengikuti kalender kurikulum. Apakah periodenya kacau?</w:t>
             </w:r>
           </w:p>
         </w:tc>
@@ -7581,23 +7749,23 @@
                 <w:sz w:val="19"/>
                 <w:szCs w:val="19"/>
               </w:rPr>
-              <w:t xml:space="preserve">Saat ini periode </w:t>
-            </w:r>
-            <w:r>
-              <w:rPr>
-                <w:b/>
-                <w:bCs/>
-                <w:sz w:val="19"/>
-                <w:szCs w:val="19"/>
-              </w:rPr>
-              <w:t xml:space="preserve">bergulir</w:t>
-            </w:r>
-            <w:r>
-              <w:rPr>
-                <w:sz w:val="19"/>
-                <w:szCs w:val="19"/>
-              </w:rPr>
-              <w:t xml:space="preserve"> (setiap 3 TO Wajib / 5 minggu Pilihan). Bila kurikulum menetapkan tanggal periode, sampaikan ke operator untuk disesuaikan.</w:t>
+              <w:t xml:space="preserve">Tidak. Periode dihitung dari </w:t>
+            </w:r>
+            <w:r>
+              <w:rPr>
+                <w:b/>
+                <w:bCs/>
+                <w:sz w:val="19"/>
+                <w:szCs w:val="19"/>
+              </w:rPr>
+              <w:t xml:space="preserve">urutan TO</w:t>
+            </w:r>
+            <w:r>
+              <w:rPr>
+                <w:sz w:val="19"/>
+                <w:szCs w:val="19"/>
+              </w:rPr>
+              <w:t xml:space="preserve"> (Wajib: TO ke-1–3 = Periode 1, dst.; Pilihan: setiap 5 minggu), jadi menukar atau menggeser hari tidak mengubah isi periode. Cukup ubah tanggal TO di Kalender.</w:t>
             </w:r>
           </w:p>
         </w:tc>

</xml_diff>

<commit_message>
TO TKA: latihan guru di kelas yang sama tidak ikut terhitung sebagai TO; panduan
Pencocokan sesi guru ke jadwal TO kini mensyaratkan paket yang sama (bila TO berpaket)
atau paket berjenis Tryout (bila belum).

Co-Authored-By: Claude Opus 5.5 <noreply@anthropic.com>
</commit_message>
<xml_diff>
--- a/Panduan_Koordinator_TO_TKA.docx
+++ b/Panduan_Koordinator_TO_TKA.docx
@@ -7834,7 +7834,7 @@
                 <w:sz w:val="19"/>
                 <w:szCs w:val="19"/>
               </w:rPr>
-              <w:t xml:space="preserve">Siswa ingin melihat pembahasan.</w:t>
+              <w:t xml:space="preserve">Sesi TO terbuka (mis. 14 hari) dan guru lain membuka latihan di kelas yang sama. Bermasalah?</w:t>
             </w:r>
           </w:p>
         </w:tc>
@@ -7857,23 +7857,23 @@
                 <w:sz w:val="19"/>
                 <w:szCs w:val="19"/>
               </w:rPr>
-              <w:t xml:space="preserve">Saat membuka sesi, centang </w:t>
-            </w:r>
-            <w:r>
-              <w:rPr>
-                <w:b/>
-                <w:bCs/>
-                <w:sz w:val="19"/>
-                <w:szCs w:val="19"/>
-              </w:rPr>
-              <w:t xml:space="preserve">Tampilkan jawaban &amp; pembahasan</w:t>
-            </w:r>
-            <w:r>
-              <w:rPr>
-                <w:sz w:val="19"/>
-                <w:szCs w:val="19"/>
-              </w:rPr>
-              <w:t xml:space="preserve">.</w:t>
+              <w:t xml:space="preserve">Tidak. Sesi TO memakai kode (sudah ada di link CBT), jadi siswa yang membuka link TO pasti masuk TO; latihan guru memakai kode lain atau jalur NISN saja. Rekap TO hanya menghitung sesi paket TO (paket yang dipasang, atau paket berjenis Tryout), jadi nilai latihan tidak tercampur. Hanya bila guru memakai </w:t>
+            </w:r>
+            <w:r>
+              <w:rPr>
+                <w:b/>
+                <w:bCs/>
+                <w:sz w:val="19"/>
+                <w:szCs w:val="19"/>
+              </w:rPr>
+              <w:t xml:space="preserve">paket yang sama</w:t>
+            </w:r>
+            <w:r>
+              <w:rPr>
+                <w:sz w:val="19"/>
+                <w:szCs w:val="19"/>
+              </w:rPr>
+              <w:t xml:space="preserve"> dengan TO, siswa yang sudah mengerjakan TO tidak bisa mengulang (satu hasil per paket).</w:t>
             </w:r>
           </w:p>
         </w:tc>
@@ -7902,7 +7902,7 @@
                 <w:sz w:val="19"/>
                 <w:szCs w:val="19"/>
               </w:rPr>
-              <w:t xml:space="preserve">Tanggal TO berubah mengikuti kalender kurikulum. Apakah periodenya kacau?</w:t>
+              <w:t xml:space="preserve">Siswa ingin melihat pembahasan.</w:t>
             </w:r>
           </w:p>
         </w:tc>
@@ -7910,6 +7910,73 @@
           <w:tcPr>
             <w:tcW w:type="dxa" w:w="6334"/>
             <w:shd w:fill="F6F8FB" w:color="auto" w:val="clear"/>
+            <w:tcMar>
+              <w:top w:type="dxa" w:w="70"/>
+              <w:left w:type="dxa" w:w="110"/>
+              <w:bottom w:type="dxa" w:w="70"/>
+              <w:right w:type="dxa" w:w="110"/>
+            </w:tcMar>
+          </w:tcPr>
+          <w:p>
+            <w:pPr>
+              <w:spacing w:after="0"/>
+            </w:pPr>
+            <w:r>
+              <w:rPr>
+                <w:sz w:val="19"/>
+                <w:szCs w:val="19"/>
+              </w:rPr>
+              <w:t xml:space="preserve">Saat membuka sesi, centang </w:t>
+            </w:r>
+            <w:r>
+              <w:rPr>
+                <w:b/>
+                <w:bCs/>
+                <w:sz w:val="19"/>
+                <w:szCs w:val="19"/>
+              </w:rPr>
+              <w:t xml:space="preserve">Tampilkan jawaban &amp; pembahasan</w:t>
+            </w:r>
+            <w:r>
+              <w:rPr>
+                <w:sz w:val="19"/>
+                <w:szCs w:val="19"/>
+              </w:rPr>
+              <w:t xml:space="preserve">.</w:t>
+            </w:r>
+          </w:p>
+        </w:tc>
+      </w:tr>
+      <w:tr>
+        <w:trPr>
+          <w:cantSplit/>
+        </w:trPr>
+        <w:tc>
+          <w:tcPr>
+            <w:tcW w:type="dxa" w:w="3304"/>
+            <w:tcMar>
+              <w:top w:type="dxa" w:w="70"/>
+              <w:left w:type="dxa" w:w="110"/>
+              <w:bottom w:type="dxa" w:w="70"/>
+              <w:right w:type="dxa" w:w="110"/>
+            </w:tcMar>
+          </w:tcPr>
+          <w:p>
+            <w:pPr>
+              <w:spacing w:after="0"/>
+            </w:pPr>
+            <w:r>
+              <w:rPr>
+                <w:sz w:val="19"/>
+                <w:szCs w:val="19"/>
+              </w:rPr>
+              <w:t xml:space="preserve">Tanggal TO berubah mengikuti kalender kurikulum. Apakah periodenya kacau?</w:t>
+            </w:r>
+          </w:p>
+        </w:tc>
+        <w:tc>
+          <w:tcPr>
+            <w:tcW w:type="dxa" w:w="6334"/>
             <w:tcMar>
               <w:top w:type="dxa" w:w="70"/>
               <w:left w:type="dxa" w:w="110"/>

</xml_diff>

<commit_message>
Tryout Umum: Unduh template & Unggah kalender (xlsx) dengan pratinjau; panduan diperbarui
Co-Authored-By: Claude Opus 5.5 <noreply@anthropic.com>
</commit_message>
<xml_diff>
--- a/Panduan_Koordinator_TO_TKA.docx
+++ b/Panduan_Koordinator_TO_TKA.docx
@@ -414,6 +414,20 @@
           <w:color w:val="33445A"/>
         </w:rPr>
         <w:t xml:space="preserve">4.4 Mengubah atau menambah jadwal</w:t>
+      </w:r>
+    </w:p>
+    <w:p>
+      <w:pPr>
+        <w:spacing w:after="50" w:before="0"/>
+        <w:ind w:left="360"/>
+      </w:pPr>
+      <w:r>
+        <w:rPr>
+          <w:b w:val="false"/>
+          <w:bCs w:val="false"/>
+          <w:color w:val="33445A"/>
+        </w:rPr>
+        <w:t xml:space="preserve">4.5 Mengisi kalender lewat Excel</w:t>
       </w:r>
     </w:p>
     <w:p>
@@ -4387,6 +4401,285 @@
     </w:p>
     <w:p>
       <w:pPr>
+        <w:pStyle w:val="Heading2"/>
+      </w:pPr>
+      <w:r>
+        <w:t xml:space="preserve">4.5 Mengisi kalender lewat Excel</w:t>
+      </w:r>
+    </w:p>
+    <w:p>
+      <w:pPr>
+        <w:spacing w:after="120"/>
+      </w:pPr>
+      <w:r>
+        <w:t xml:space="preserve">Untuk banyak jadwal sekaligus (misalnya kalender satu semester dari kurikulum), pakai dua tombol di tab </w:t>
+      </w:r>
+      <w:r>
+        <w:rPr>
+          <w:b/>
+          <w:bCs/>
+        </w:rPr>
+        <w:t xml:space="preserve">Kalender</w:t>
+      </w:r>
+      <w:r>
+        <w:t xml:space="preserve">:</w:t>
+      </w:r>
+    </w:p>
+    <w:p>
+      <w:pPr>
+        <w:pStyle w:val="ListParagraph"/>
+        <w:numPr>
+          <w:ilvl w:val="0"/>
+          <w:numId w:val="3"/>
+        </w:numPr>
+        <w:spacing w:after="60"/>
+      </w:pPr>
+      <w:r>
+        <w:t xml:space="preserve">Pilih semesternya di kanan atas, lalu tekan </w:t>
+      </w:r>
+      <w:r>
+        <w:rPr>
+          <w:b/>
+          <w:bCs/>
+        </w:rPr>
+        <w:t xml:space="preserve">⬇ Unduh template</w:t>
+      </w:r>
+      <w:r>
+        <w:t xml:space="preserve">. Berkas Excel berisi lembar </w:t>
+      </w:r>
+      <w:r>
+        <w:rPr>
+          <w:b/>
+          <w:bCs/>
+        </w:rPr>
+        <w:t xml:space="preserve">TO Mapel Wajib</w:t>
+      </w:r>
+      <w:r>
+        <w:t xml:space="preserve"> dan </w:t>
+      </w:r>
+      <w:r>
+        <w:rPr>
+          <w:b/>
+          <w:bCs/>
+        </w:rPr>
+        <w:t xml:space="preserve">TO Mapel Pilihan</w:t>
+      </w:r>
+      <w:r>
+        <w:t xml:space="preserve"> yang sudah terisi jadwal semester itu, lembar </w:t>
+      </w:r>
+      <w:r>
+        <w:rPr>
+          <w:b/>
+          <w:bCs/>
+        </w:rPr>
+        <w:t xml:space="preserve">Petunjuk</w:t>
+      </w:r>
+      <w:r>
+        <w:t xml:space="preserve">, dan </w:t>
+      </w:r>
+      <w:r>
+        <w:rPr>
+          <w:b/>
+          <w:bCs/>
+        </w:rPr>
+        <w:t xml:space="preserve">Daftar guru</w:t>
+      </w:r>
+      <w:r>
+        <w:t xml:space="preserve">.</w:t>
+      </w:r>
+    </w:p>
+    <w:p>
+      <w:pPr>
+        <w:pStyle w:val="ListParagraph"/>
+        <w:numPr>
+          <w:ilvl w:val="0"/>
+          <w:numId w:val="3"/>
+        </w:numPr>
+        <w:spacing w:after="60"/>
+      </w:pPr>
+      <w:r>
+        <w:t xml:space="preserve">Ubah di Excel: ganti tanggal, jam ke-, kelas, mapel, guru; tambah baris baru dengan </w:t>
+      </w:r>
+      <w:r>
+        <w:rPr>
+          <w:b/>
+          <w:bCs/>
+        </w:rPr>
+        <w:t xml:space="preserve">kolom ID dikosongkan</w:t>
+      </w:r>
+      <w:r>
+        <w:t xml:space="preserve">; tulis </w:t>
+      </w:r>
+      <w:r>
+        <w:rPr>
+          <w:b/>
+          <w:bCs/>
+        </w:rPr>
+        <w:t xml:space="preserve">Ya</w:t>
+      </w:r>
+      <w:r>
+        <w:t xml:space="preserve"> di kolom </w:t>
+      </w:r>
+      <w:r>
+        <w:rPr>
+          <w:b/>
+          <w:bCs/>
+        </w:rPr>
+        <w:t xml:space="preserve">Batal</w:t>
+      </w:r>
+      <w:r>
+        <w:t xml:space="preserve"> untuk TO yang batal. Kolom </w:t>
+      </w:r>
+      <w:r>
+        <w:rPr>
+          <w:b/>
+          <w:bCs/>
+        </w:rPr>
+        <w:t xml:space="preserve">Kelas</w:t>
+      </w:r>
+      <w:r>
+        <w:t xml:space="preserve">: tulis tingkat (10, 11, 12) untuk semua kelas di tingkat itu, atau daftar kelas (11-1, 11-2).</w:t>
+      </w:r>
+    </w:p>
+    <w:p>
+      <w:pPr>
+        <w:pStyle w:val="ListParagraph"/>
+        <w:numPr>
+          <w:ilvl w:val="0"/>
+          <w:numId w:val="3"/>
+        </w:numPr>
+        <w:spacing w:after="60"/>
+      </w:pPr>
+      <w:r>
+        <w:t xml:space="preserve">Tekan </w:t>
+      </w:r>
+      <w:r>
+        <w:rPr>
+          <w:b/>
+          <w:bCs/>
+        </w:rPr>
+        <w:t xml:space="preserve">⬆ Unggah kalender</w:t>
+      </w:r>
+      <w:r>
+        <w:t xml:space="preserve"> dan pilih berkasnya. Muncul </w:t>
+      </w:r>
+      <w:r>
+        <w:rPr>
+          <w:b/>
+          <w:bCs/>
+        </w:rPr>
+        <w:t xml:space="preserve">Pratinjau perubahan</w:t>
+      </w:r>
+      <w:r>
+        <w:t xml:space="preserve">: jumlah baris baru, berubah, dan tetap, serta baris yang salah beserta alasannya.</w:t>
+      </w:r>
+    </w:p>
+    <w:p>
+      <w:pPr>
+        <w:pStyle w:val="ListParagraph"/>
+        <w:numPr>
+          <w:ilvl w:val="0"/>
+          <w:numId w:val="3"/>
+        </w:numPr>
+        <w:spacing w:after="60"/>
+      </w:pPr>
+      <w:r>
+        <w:t xml:space="preserve">Bila ada baris salah, betulkan di Excel lalu unggah lagi (tidak ada yang tersimpan selama masih ada yang salah). Bila sudah benar, tekan </w:t>
+      </w:r>
+      <w:r>
+        <w:rPr>
+          <w:b/>
+          <w:bCs/>
+        </w:rPr>
+        <w:t xml:space="preserve">Simpan … perubahan</w:t>
+      </w:r>
+      <w:r>
+        <w:t xml:space="preserve">.</w:t>
+      </w:r>
+    </w:p>
+    <w:tbl>
+      <w:tblPr>
+        <w:tblW w:type="dxa" w:w="9638"/>
+        <w:tblBorders>
+          <w:top w:val="none" w:color="FFFFFF" w:sz="0"/>
+          <w:left w:val="single" w:color="C98A12" w:sz="30"/>
+          <w:bottom w:val="none" w:color="FFFFFF" w:sz="0"/>
+          <w:right w:val="none" w:color="FFFFFF" w:sz="0"/>
+          <w:insideH w:val="none" w:color="FFFFFF" w:sz="0"/>
+          <w:insideV w:val="none" w:color="FFFFFF" w:sz="0"/>
+        </w:tblBorders>
+      </w:tblPr>
+      <w:tblGrid>
+        <w:gridCol w:w="9638"/>
+      </w:tblGrid>
+      <w:tr>
+        <w:trPr>
+          <w:cantSplit/>
+        </w:trPr>
+        <w:tc>
+          <w:tcPr>
+            <w:tcW w:type="dxa" w:w="9638"/>
+            <w:shd w:fill="FDF4E1" w:color="auto" w:val="clear"/>
+            <w:tcMar>
+              <w:top w:type="dxa" w:w="120"/>
+              <w:left w:type="dxa" w:w="200"/>
+              <w:bottom w:type="dxa" w:w="120"/>
+              <w:right w:type="dxa" w:w="160"/>
+            </w:tcMar>
+          </w:tcPr>
+          <w:p>
+            <w:pPr>
+              <w:spacing w:after="40"/>
+            </w:pPr>
+            <w:r>
+              <w:rPr>
+                <w:b/>
+                <w:bCs/>
+                <w:color w:val="C98A12"/>
+                <w:sz w:val="20"/>
+                <w:szCs w:val="20"/>
+              </w:rPr>
+              <w:t xml:space="preserve">Jangan ubah kolom ID</w:t>
+            </w:r>
+          </w:p>
+          <w:p>
+            <w:pPr>
+              <w:spacing w:after="40"/>
+            </w:pPr>
+            <w:r>
+              <w:rPr>
+                <w:sz w:val="19"/>
+                <w:szCs w:val="19"/>
+              </w:rPr>
+              <w:t xml:space="preserve">ID menghubungkan baris Excel dengan jadwal di aplikasi (beserta soal dan sesinya). Jadwal yang barisnya dihapus dari Excel </w:t>
+            </w:r>
+            <w:r>
+              <w:rPr>
+                <w:b/>
+                <w:bCs/>
+                <w:sz w:val="19"/>
+                <w:szCs w:val="19"/>
+              </w:rPr>
+              <w:t xml:space="preserve">tidak ikut terhapus</w:t>
+            </w:r>
+            <w:r>
+              <w:rPr>
+                <w:sz w:val="19"/>
+                <w:szCs w:val="19"/>
+              </w:rPr>
+              <w:t xml:space="preserve"> — untuk membatalkan, pakai kolom Batal. Bila tanggal TO yang sudah punya sesi diubah, sesinya tidak ikut pindah; ubah waktunya di tab Sesi &amp; Link.</w:t>
+            </w:r>
+          </w:p>
+        </w:tc>
+      </w:tr>
+    </w:tbl>
+    <w:p>
+      <w:pPr>
+        <w:spacing w:after="120"/>
+      </w:pPr>
+    </w:p>
+    <w:p>
+      <w:pPr>
         <w:pStyle w:val="Heading1"/>
         <w:pageBreakBefore/>
       </w:pPr>
@@ -5049,7 +5342,7 @@
         <w:pStyle w:val="ListParagraph"/>
         <w:numPr>
           <w:ilvl w:val="0"/>
-          <w:numId w:val="3"/>
+          <w:numId w:val="4"/>
         </w:numPr>
         <w:spacing w:after="60"/>
       </w:pPr>
@@ -5072,7 +5365,7 @@
         <w:pStyle w:val="ListParagraph"/>
         <w:numPr>
           <w:ilvl w:val="0"/>
-          <w:numId w:val="3"/>
+          <w:numId w:val="4"/>
         </w:numPr>
         <w:spacing w:after="60"/>
       </w:pPr>
@@ -5095,7 +5388,7 @@
         <w:pStyle w:val="ListParagraph"/>
         <w:numPr>
           <w:ilvl w:val="0"/>
-          <w:numId w:val="3"/>
+          <w:numId w:val="4"/>
         </w:numPr>
         <w:spacing w:after="60"/>
       </w:pPr>
@@ -5108,7 +5401,7 @@
         <w:pStyle w:val="ListParagraph"/>
         <w:numPr>
           <w:ilvl w:val="0"/>
-          <w:numId w:val="3"/>
+          <w:numId w:val="4"/>
         </w:numPr>
         <w:spacing w:after="60"/>
       </w:pPr>
@@ -5131,7 +5424,7 @@
         <w:pStyle w:val="ListParagraph"/>
         <w:numPr>
           <w:ilvl w:val="0"/>
-          <w:numId w:val="3"/>
+          <w:numId w:val="4"/>
         </w:numPr>
         <w:spacing w:after="60"/>
       </w:pPr>
@@ -8423,6 +8716,12 @@
     </w:lvlOverride>
   </w:num>
   <w:num w:numId="3">
+    <w:abstractNumId w:val="2"/>
+    <w:lvlOverride w:ilvl="0">
+      <w:startOverride w:val="1"/>
+    </w:lvlOverride>
+  </w:num>
+  <w:num w:numId="4">
     <w:abstractNumId w:val="2"/>
     <w:lvlOverride w:ilvl="0">
       <w:startOverride w:val="1"/>

</xml_diff>